<commit_message>
modifying W5 report to add github repo link
</commit_message>
<xml_diff>
--- a/Archer_SDC485L_W5_Project_Scenario_Report.docx
+++ b/Archer_SDC485L_W5_Project_Scenario_Report.docx
@@ -57,6 +57,23 @@
         </w:rPr>
         <w:t xml:space="preserve">GitHub Repository: </w:t>
       </w:r>
+      <w:hyperlink r:id="rId5" w:history="1">
+        <w:r>
+          <w:rPr>
+            <w:rStyle w:val="Hyperlink"/>
+            <w:b/>
+            <w:bCs/>
+          </w:rPr>
+          <w:t>https://github.com/thepacketpoet-school/sdc485/tree/sdc485l-project</w:t>
+        </w:r>
+      </w:hyperlink>
+      <w:r>
+        <w:rPr>
+          <w:b/>
+          <w:bCs/>
+        </w:rPr>
+        <w:t xml:space="preserve"> </w:t>
+      </w:r>
     </w:p>
     <w:p>
       <w:pPr>
@@ -144,6 +161,7 @@
           <w:bCs w:val="0"/>
           <w:i/>
           <w:iCs/>
+          <w:noProof/>
           <w:sz w:val="24"/>
           <w:szCs w:val="24"/>
         </w:rPr>
@@ -164,7 +182,7 @@
                     <pic:cNvPicPr/>
                   </pic:nvPicPr>
                   <pic:blipFill>
-                    <a:blip r:embed="rId5"/>
+                    <a:blip r:embed="rId6"/>
                     <a:stretch>
                       <a:fillRect/>
                     </a:stretch>
@@ -224,6 +242,7 @@
           <w:bCs w:val="0"/>
           <w:i/>
           <w:iCs/>
+          <w:noProof/>
           <w:sz w:val="24"/>
           <w:szCs w:val="24"/>
         </w:rPr>
@@ -244,7 +263,7 @@
                     <pic:cNvPicPr/>
                   </pic:nvPicPr>
                   <pic:blipFill>
-                    <a:blip r:embed="rId6"/>
+                    <a:blip r:embed="rId7"/>
                     <a:stretch>
                       <a:fillRect/>
                     </a:stretch>
@@ -268,6 +287,9 @@
         <w:br/>
       </w:r>
       <w:r>
+        <w:rPr>
+          <w:noProof/>
+        </w:rPr>
         <w:drawing>
           <wp:inline distT="0" distB="0" distL="0" distR="0" wp14:anchorId="3269D38F" wp14:editId="42707AE8">
             <wp:extent cx="5943600" cy="3517265"/>
@@ -284,7 +306,7 @@
                     <pic:cNvPicPr/>
                   </pic:nvPicPr>
                   <pic:blipFill>
-                    <a:blip r:embed="rId7"/>
+                    <a:blip r:embed="rId8"/>
                     <a:stretch>
                       <a:fillRect/>
                     </a:stretch>
@@ -326,6 +348,9 @@
         <w:br/>
       </w:r>
       <w:r>
+        <w:rPr>
+          <w:noProof/>
+        </w:rPr>
         <w:lastRenderedPageBreak/>
         <w:drawing>
           <wp:inline distT="0" distB="0" distL="0" distR="0" wp14:anchorId="50A74825" wp14:editId="38AABF61">
@@ -343,7 +368,7 @@
                     <pic:cNvPicPr/>
                   </pic:nvPicPr>
                   <pic:blipFill>
-                    <a:blip r:embed="rId8"/>
+                    <a:blip r:embed="rId9"/>
                     <a:stretch>
                       <a:fillRect/>
                     </a:stretch>
@@ -364,6 +389,9 @@
         </w:drawing>
       </w:r>
       <w:r>
+        <w:rPr>
+          <w:noProof/>
+        </w:rPr>
         <w:drawing>
           <wp:inline distT="0" distB="0" distL="0" distR="0" wp14:anchorId="702B007B" wp14:editId="65227242">
             <wp:extent cx="5943600" cy="2647315"/>
@@ -380,7 +408,7 @@
                     <pic:cNvPicPr/>
                   </pic:nvPicPr>
                   <pic:blipFill>
-                    <a:blip r:embed="rId9"/>
+                    <a:blip r:embed="rId10"/>
                     <a:stretch>
                       <a:fillRect/>
                     </a:stretch>
@@ -1364,6 +1392,18 @@
       <w:szCs w:val="20"/>
     </w:rPr>
   </w:style>
+  <w:style w:type="character" w:styleId="UnresolvedMention">
+    <w:name w:val="Unresolved Mention"/>
+    <w:basedOn w:val="DefaultParagraphFont"/>
+    <w:uiPriority w:val="99"/>
+    <w:semiHidden/>
+    <w:unhideWhenUsed/>
+    <w:rsid w:val="00096897"/>
+    <w:rPr>
+      <w:color w:val="605E5C"/>
+      <w:shd w:val="clear" w:color="auto" w:fill="E1DFDD"/>
+    </w:rPr>
+  </w:style>
 </w:styles>
 </file>
 

</xml_diff>